<commit_message>
fix: align intern copy fields on proportional stipend receipt template
Replace hardcoded period and amount on the intern via with docxtemplater placeholders so both copies match.

Co-authored-by: Cursor <cursoragent@cursor.com>
</commit_message>
<xml_diff>
--- a/public/templates/recibo-bolsa-proporcional.docx
+++ b/public/templates/recibo-bolsa-proporcional.docx
@@ -420,14 +420,7 @@
               <w:t xml:space="preserve">: </w:t>
             </w:r>
             <w:r>
-              <w:t>01/09/2026 á 15/09/</w:t>
-            </w:r>
-            <w:proofErr w:type="gramStart"/>
-            <w:r>
-              <w:t>2026</w:t>
-            </w:r>
-            <w:r>
-              <w:t xml:space="preserve">  </w:t>
+              <w:t>{periodoReferencia}</w:t>
             </w:r>
             <w:r>
               <w:rPr>
@@ -491,14 +484,7 @@
                 <w:b/>
                 <w:bCs/>
               </w:rPr>
-              <w:t xml:space="preserve">: R$ </w:t>
-            </w:r>
-            <w:r>
-              <w:rPr>
-                <w:b/>
-                <w:bCs/>
-              </w:rPr>
-              <w:t>400,00</w:t>
+              <w:t>: {valorTotal}</w:t>
             </w:r>
           </w:p>
           <w:p>

</xml_diff>